<commit_message>
Fix z-bar rendering in Class 11 Paper 1 (accent U+203E -> U+0305)
Co-Authored-By: Claude Opus 5.5 <noreply@anthropic.com>
Claude-Session: https://claude.ai/code/session_01ABwg7zJ6HxiQEVye1MWpxq
</commit_message>
<xml_diff>
--- a/papers/class11_v2/AMO_C11_L1_PracticePaper1_v2.docx
+++ b/papers/class11_v2/AMO_C11_L1_PracticePaper1_v2.docx
@@ -1496,7 +1496,7 @@
             <m:oMath>
               <m:acc>
                 <m:accPr>
-                  <m:chr m:val="‾"/>
+                  <m:chr m:val="̅"/>
                 </m:accPr>
                 <m:e>
                   <m:r>
@@ -1864,7 +1864,7 @@
               </m:r>
               <m:acc>
                 <m:accPr>
-                  <m:chr m:val="‾"/>
+                  <m:chr m:val="̅"/>
                 </m:accPr>
                 <m:e>
                   <m:r>

</xml_diff>